<commit_message>
Updating the svgs and organising them. Few bug fixes.
</commit_message>
<xml_diff>
--- a/Resources/Ramji_Sridaran_12_Years.docx
+++ b/Resources/Ramji_Sridaran_12_Years.docx
@@ -684,7 +684,7 @@
                       <w:sz w:val="20"/>
                     </w:rPr>
                     <w:drawing>
-                      <wp:inline distT="0" distB="0" distL="0" distR="0" wp14:anchorId="67D01115" wp14:editId="5E4CC042">
+                      <wp:inline distT="0" distB="0" distL="0" distR="0" wp14:anchorId="67D01115" wp14:editId="5C6E5A35">
                         <wp:extent cx="148442" cy="148442"/>
                         <wp:effectExtent l="0" t="0" r="4445" b="4445"/>
                         <wp:docPr id="5" name="Picture 5"/>
@@ -4605,9 +4605,10 @@
                   <w:r>
                     <w:rPr>
                       <w:b/>
-                      <w:sz w:val="20"/>
-                    </w:rPr>
-                    <w:t>Senior Software Engineer</w:t>
+                      <w:bCs/>
+                      <w:sz w:val="20"/>
+                    </w:rPr>
+                    <w:t>SENIOR SOFTWARE ENGINEER</w:t>
                   </w:r>
                 </w:p>
                 <w:p>

</xml_diff>